<commit_message>
SAVOLA corrected on the same growth-basis error
Its terminal was handed a profit figure, a depreciation charge and a working
capital balance ALL already grown by (1+g), which the sanctioned construction
grows again. Central 27.1153 -> 26.6424, gap -10.5% -> -12.1%.

The correction shows up in the ledger where it belongs: the terminal lever
read -0.6% and reads -2.3% corrected, so the route is 27.2426 -> 27.4379 ->
26.8054 -> 26.6424. It takes MORE off, not less.

Workbook, documents, register, figures, ledger and gap review all rebuilt on
it. Study checks: recalc 809 of 809 formula cells, 51 drivers, 30 tables 0
unreconciled, 383 prose figures 0 unmatched.

Four studies remain on this error: AIRARABIA, EMPOWER, DU, MODON.

Co-Authored-By: Claude Opus 5 <noreply@anthropic.com>
Claude-Session: https://claude.ai/code/session_017RcjXG4ETjADcoFJf123yY
</commit_message>
<xml_diff>
--- a/engine/savola_study/SAVOLA_Valuation_Study_19-08-2026_public.docx
+++ b/engine/savola_study/SAVOLA_Valuation_Study_19-08-2026_public.docx
@@ -118,7 +118,7 @@
           <w:color w:val="6E7B77"/>
           <w:sz w:val="19"/>
         </w:rPr>
-        <w:t>This edition restrikes the 18-Aug-2026 first edition after a four-critique external audit, worked finding by finding (82 findings; the response record accompanies the study's repository). The principal corrections and what each is worth are listed in About; the weighted central moved SAR 28.02 to SAR 27.12.</w:t>
+        <w:t>This edition restrikes the 18-Aug-2026 first edition after a four-critique external audit, worked finding by finding (82 findings; the response record accompanies the study's repository). The principal corrections and what each is worth are listed in About; the weighted central moved SAR 28.02 to SAR 26.64.</w:t>
       </w:r>
     </w:p>
     <w:p>
@@ -234,7 +234,7 @@
                 <w:color w:val="1C3A36"/>
                 <w:sz w:val="19"/>
               </w:rPr>
-              <w:t>Weighted central SAR 27.12 per share against a spot of SAR 30.30 (-11%), inside a weighted bear-to-bull range of SAR 17.87 to 32.80 and a wider span across the four lenses of SAR 8.42 to SAR 39.51. The cash-flow lens alone reads SAR 24.65; the market-anchored relative lens reads SAR 28.22; the book lens reads SAR 24.67. The spread is the study's honest tension — section 4 explains it rather than hiding it.</w:t>
+              <w:t>Weighted central SAR 26.64 per share against a spot of SAR 30.30 (-12%), inside a weighted bear-to-bull range of SAR 17.54 to 32.25 and a wider span across the four lenses of SAR 7.70 to SAR 39.51. The cash-flow lens alone reads SAR 23.60; the market-anchored relative lens reads SAR 28.22; the book lens reads SAR 24.67. The spread is the study's honest tension — section 4 explains it rather than hiding it.</w:t>
             </w:r>
           </w:p>
           <w:p>
@@ -254,7 +254,7 @@
                 <w:color w:val="1C3A36"/>
                 <w:sz w:val="19"/>
               </w:rPr>
-              <w:t>Is Panda's 20-store-a-year expansion creating value or burning it? Sales per store FELL between 6.0% and 7.1% in the first half of 2026 (a range, because the mid-2025 store count is not published) as new, smaller stores opened into a discounter-crowded market. Let density stabilise as the store-refresh programme matures and the model reads SAR 24.65; hold the measured erosion forever and the same model reads SAR 18.45. The judgement is worth SAR 6.20 per share, and both framings are published side by side — never averaged.</w:t>
+              <w:t>Is Panda's 20-store-a-year expansion creating value or burning it? Sales per store FELL between 6.0% and 7.1% in the first half of 2026 (a range, because the mid-2025 store count is not published) as new, smaller stores opened into a discounter-crowded market. Let density stabilise as the store-refresh programme matures and the model reads SAR 23.60; hold the measured erosion forever and the same model reads SAR 17.53. The judgement is worth SAR 6.07 per share, and both framings are published side by side — never averaged.</w:t>
             </w:r>
           </w:p>
           <w:p>
@@ -477,7 +477,7 @@
                 <w:color w:val="1C3A36"/>
                 <w:sz w:val="17"/>
               </w:rPr>
-              <w:t>8.42</w:t>
+              <w:t>7.70</w:t>
             </w:r>
           </w:p>
         </w:tc>
@@ -495,7 +495,7 @@
                 <w:color w:val="1C3A36"/>
                 <w:sz w:val="17"/>
               </w:rPr>
-              <w:t>24.65</w:t>
+              <w:t>23.60</w:t>
             </w:r>
           </w:p>
         </w:tc>
@@ -513,7 +513,7 @@
                 <w:color w:val="1C3A36"/>
                 <w:sz w:val="17"/>
               </w:rPr>
-              <w:t>32.95</w:t>
+              <w:t>31.73</w:t>
             </w:r>
           </w:p>
         </w:tc>
@@ -549,7 +549,7 @@
                 <w:color w:val="1C3A36"/>
                 <w:sz w:val="17"/>
               </w:rPr>
-              <w:t>-19%</w:t>
+              <w:t>-22%</w:t>
             </w:r>
           </w:p>
         </w:tc>
@@ -917,7 +917,7 @@
                 <w:color w:val="1C3A36"/>
                 <w:sz w:val="17"/>
               </w:rPr>
-              <w:t>17.87</w:t>
+              <w:t>17.54</w:t>
             </w:r>
           </w:p>
         </w:tc>
@@ -937,7 +937,7 @@
                 <w:color w:val="1C3A36"/>
                 <w:sz w:val="17"/>
               </w:rPr>
-              <w:t>27.12</w:t>
+              <w:t>26.64</w:t>
             </w:r>
           </w:p>
         </w:tc>
@@ -957,7 +957,7 @@
                 <w:color w:val="1C3A36"/>
                 <w:sz w:val="17"/>
               </w:rPr>
-              <w:t>32.80</w:t>
+              <w:t>32.25</w:t>
             </w:r>
           </w:p>
         </w:tc>
@@ -997,7 +997,7 @@
                 <w:color w:val="1C3A36"/>
                 <w:sz w:val="17"/>
               </w:rPr>
-              <w:t>-11%</w:t>
+              <w:t>-12%</w:t>
             </w:r>
           </w:p>
         </w:tc>
@@ -1034,7 +1034,7 @@
                 <w:color w:val="1C3A36"/>
                 <w:sz w:val="17"/>
               </w:rPr>
-              <w:t>8.42</w:t>
+              <w:t>7.70</w:t>
             </w:r>
           </w:p>
         </w:tc>
@@ -1158,7 +1158,7 @@
                 <w:color w:val="1C3A36"/>
                 <w:sz w:val="17"/>
               </w:rPr>
-              <w:t>18.45</w:t>
+              <w:t>17.53</w:t>
             </w:r>
           </w:p>
         </w:tc>
@@ -1211,7 +1211,7 @@
                 <w:color w:val="1C3A36"/>
                 <w:sz w:val="17"/>
               </w:rPr>
-              <w:t>-39%</w:t>
+              <w:t>-42%</w:t>
             </w:r>
           </w:p>
         </w:tc>
@@ -1265,7 +1265,7 @@
                 <w:color w:val="1C3A36"/>
                 <w:sz w:val="17"/>
               </w:rPr>
-              <w:t>19.12</w:t>
+              <w:t>18.23</w:t>
             </w:r>
           </w:p>
         </w:tc>
@@ -1318,7 +1318,7 @@
                 <w:color w:val="1C3A36"/>
                 <w:sz w:val="17"/>
               </w:rPr>
-              <w:t>-37%</w:t>
+              <w:t>-40%</w:t>
             </w:r>
           </w:p>
         </w:tc>
@@ -1372,7 +1372,7 @@
                 <w:color w:val="1C3A36"/>
                 <w:sz w:val="17"/>
               </w:rPr>
-              <w:t>22.82</w:t>
+              <w:t>21.82</w:t>
             </w:r>
           </w:p>
         </w:tc>
@@ -1425,7 +1425,7 @@
                 <w:color w:val="1C3A36"/>
                 <w:sz w:val="17"/>
               </w:rPr>
-              <w:t>-25%</w:t>
+              <w:t>-28%</w:t>
             </w:r>
           </w:p>
         </w:tc>
@@ -1658,7 +1658,7 @@
           <w:color w:val="6E7B77"/>
           <w:sz w:val="17"/>
         </w:rPr>
-        <w:t>Table 1 — the valuation summary. Weighted central SAR 27.12, its bear and bull columns weighted on the same 45/25/15/15 basis; beneath it the wider min/max span across lenses, which is NOT a weighted figure. Dating, stated per lens: the cash-flow lens is dated 31-Dec-2025 and its Dec-dated legs are rolled to the 2026-08-18 anchor net of the SAR 1.70 dividend (ex-date 07-May-2026); the relative and normalised lenses are anchor-dated by construction (their multiples are 18-Aug quotes); the book lens stands on the 30-Jun-2026 reviewed equity. The terminal value is 79% of the DCF enterprise value — higher than the first edition's 76% because charging the full lease additions back-loads the free cash flow — and what that terminal implies is priced explicitly in sections 1.1 and 1.9.</w:t>
+        <w:t>Table 1 — the valuation summary. Weighted central SAR 26.64, its bear and bull columns weighted on the same 45/25/15/15 basis; beneath it the wider min/max span across lenses, which is NOT a weighted figure. Dating, stated per lens: the cash-flow lens is dated 31-Dec-2025 and its Dec-dated legs are rolled to the 2026-08-18 anchor net of the SAR 1.70 dividend (ex-date 07-May-2026); the relative and normalised lenses are anchor-dated by construction (their multiples are 18-Aug quotes); the book lens stands on the 30-Jun-2026 reviewed equity. The terminal value is 79% of the DCF enterprise value — higher than the first edition's 76% because charging the full lease additions back-loads the free cash flow — and what that terminal implies is priced explicitly in sections 1.1 and 1.9.</w:t>
       </w:r>
     </w:p>
     <w:p>
@@ -3483,7 +3483,7 @@
           <w:color w:val="1C3A36"/>
           <w:sz w:val="21"/>
         </w:rPr>
-        <w:t>What the terminal charges for is capital MAINTENANCE, at what replacement actually costs. Terminal operating profit after tax is SAR 1,169mn; the SAR 760mn of owned and intangible depreciation is added back because that profit is already struck after it, and against it the model charges SAR 909mn — the same charge escalated over half the 18.0-year life of the depreciable asset base. That life is not picked: the accounting policy gives RANGES for five classes and no weighting, so it is derived from the note's own two columns, the gross cost of the depreciable base divided by the year's own depreciation, and cross-checks at 17.05 years on the prior year's columns. Inflation on the working capital AND the lease book the group carries takes a further SAR 117mn — the lease book belongs there because the explicit years charge its growth as cash out, and a terminal that left it out would hand this group a rent-free store estate for ever. Real growth costs SAR 80mn, the capital this model's own forecast spends per unit of revenue. That leaves SAR 823mn, 70.4% of terminal profit.</w:t>
+        <w:t>What the terminal charges for is capital MAINTENANCE, at what replacement actually costs. Terminal operating profit after tax is SAR 1,138mn; the SAR 740mn of owned and intangible depreciation is added back because that profit is already struck after it, and against it the model charges SAR 885mn — the same charge escalated over half the 18.0-year life of the depreciable asset base. That life is not picked: the accounting policy gives RANGES for five classes and no weighting, so it is derived from the note's own two columns, the gross cost of the depreciable base divided by the year's own depreciation, and cross-checks at 17.05 years on the prior year's columns. Inflation on the working capital AND the lease book the group carries takes a further SAR 114mn — the lease book belongs there because the explicit years charge its growth as cash out, and a terminal that left it out would hand this group a rent-free store estate for ever. Real growth costs SAR 80mn, the capital this model's own forecast spends per unit of revenue. That leaves SAR 799mn, 70.2% of terminal profit.</w:t>
       </w:r>
     </w:p>
     <w:p>
@@ -3497,7 +3497,7 @@
           <w:color w:val="1C3A36"/>
           <w:sz w:val="21"/>
         </w:rPr>
-        <w:t>The previous edition built this block a different way, and the difference is worth a sentence because the answer barely moved. It grew terminal profit and deducted a reinvestment rate set by the growth rate divided by the return on capital, which is arithmetically the same as rebuilding the entire capital base every 37 years — a fact about the riyal's peg to the dollar rather than about a supermarket, a flour mill or a delivery van, where the note says the depreciable base turns over in 18.0. The terminal value on the new construction is 0.9% below the old one. A useful marker beside it: a business that simply held its profit flat for ever, charging only the depreciation its books already record, would be worth SAR 13,883mn, so this terminal sits 6.8% above that marker. The one real judgement left is the life, and the note can be read a second way — accumulated depreciation over the same charge says the base has already taken 11.27 years of depreciation, against the 9.02 the formula assumes. Reading it that way is published beside the base at SAR 22.82 and never averaged into it.</w:t>
+        <w:t>The previous edition built this block a different way, and the difference is worth a sentence because the answer barely moved. It grew terminal profit and deducted a reinvestment rate set by the growth rate divided by the return on capital, which is arithmetically the same as rebuilding the entire capital base every 37 years — a fact about the riyal's peg to the dollar rather than about a supermarket, a flour mill or a delivery van, where the note says the depreciable base turns over in 18.0. The terminal value on the new construction is 3.8% below the old one. A useful marker beside it: a business that simply held its profit flat for ever, charging only the depreciation its books already record, would be worth SAR 13,516mn, so this terminal sits 6.5% above that marker. The one real judgement left is the life, and the note can be read a second way — accumulated depreciation over the same charge says the base has already taken 11.27 years of depreciation, against the 9.02 the formula assumes. Reading it that way is published beside the base at SAR 21.82 and never averaged into it.</w:t>
       </w:r>
     </w:p>
     <w:p>
@@ -3511,7 +3511,7 @@
           <w:color w:val="1C3A36"/>
           <w:sz w:val="21"/>
         </w:rPr>
-        <w:t>The terminal value is SAR 14,822mn, whose present value is SAR 10,057mn — 79% of enterprise value, higher than the first edition's 76% because the corrected lease charge back-loads the explicit years. A reader should sit with that number: four fifths of this valuation is the going concern beyond 2030. Section 1.9 prices the moves.</w:t>
+        <w:t>The terminal value is SAR 14,392mn, whose present value is SAR 9,766mn — 79% of enterprise value, higher than the first edition's 76% because the corrected lease charge back-loads the explicit years. A reader should sit with that number: four fifths of this valuation is the going concern beyond 2030. Section 1.9 prices the moves.</w:t>
       </w:r>
     </w:p>
     <w:p>
@@ -3701,7 +3701,7 @@
                 <w:color w:val="1C3A36"/>
                 <w:sz w:val="17"/>
               </w:rPr>
-              <w:t>10,057</w:t>
+              <w:t>9,766</w:t>
             </w:r>
           </w:p>
         </w:tc>
@@ -3719,7 +3719,7 @@
                 <w:color w:val="1C3A36"/>
                 <w:sz w:val="17"/>
               </w:rPr>
-              <w:t>33.90</w:t>
+              <w:t>32.92</w:t>
             </w:r>
           </w:p>
         </w:tc>
@@ -3760,7 +3760,7 @@
                 <w:color w:val="1C3A36"/>
                 <w:sz w:val="17"/>
               </w:rPr>
-              <w:t>12,698</w:t>
+              <w:t>12,407</w:t>
             </w:r>
           </w:p>
         </w:tc>
@@ -3780,7 +3780,7 @@
                 <w:color w:val="1C3A36"/>
                 <w:sz w:val="17"/>
               </w:rPr>
-              <w:t>42.80</w:t>
+              <w:t>41.82</w:t>
             </w:r>
           </w:p>
         </w:tc>
@@ -4351,7 +4351,7 @@
                 <w:color w:val="1C3A36"/>
                 <w:sz w:val="17"/>
               </w:rPr>
-              <w:t>Dec-2025-dated legs, subtotal — the roll to the anchor at the cost of equity (factor 1.0690) takes this to SAR 7,686mn</w:t>
+              <w:t>Dec-2025-dated legs, subtotal — the roll to the anchor at the cost of equity (factor 1.0690) takes this to SAR 7,374mn</w:t>
             </w:r>
           </w:p>
         </w:tc>
@@ -4371,7 +4371,7 @@
                 <w:color w:val="1C3A36"/>
                 <w:sz w:val="17"/>
               </w:rPr>
-              <w:t>7,190</w:t>
+              <w:t>6,898</w:t>
             </w:r>
           </w:p>
         </w:tc>
@@ -4391,7 +4391,7 @@
                 <w:color w:val="1C3A36"/>
                 <w:sz w:val="17"/>
               </w:rPr>
-              <w:t>24.23</w:t>
+              <w:t>23.25</w:t>
             </w:r>
           </w:p>
         </w:tc>
@@ -4597,7 +4597,7 @@
                 <w:color w:val="1C3A36"/>
                 <w:sz w:val="17"/>
               </w:rPr>
-              <w:t>7,817</w:t>
+              <w:t>7,505</w:t>
             </w:r>
           </w:p>
         </w:tc>
@@ -4617,7 +4617,7 @@
                 <w:color w:val="1C3A36"/>
                 <w:sz w:val="17"/>
               </w:rPr>
-              <w:t>26.35</w:t>
+              <w:t>25.30</w:t>
             </w:r>
           </w:p>
         </w:tc>
@@ -4671,7 +4671,7 @@
                 <w:color w:val="1C3A36"/>
                 <w:sz w:val="17"/>
               </w:rPr>
-              <w:t>24.65</w:t>
+              <w:t>23.60</w:t>
             </w:r>
           </w:p>
         </w:tc>
@@ -4746,7 +4746,7 @@
           <w:color w:val="6E7B77"/>
           <w:sz w:val="17"/>
         </w:rPr>
-        <w:t>Table 3 — from enterprise value to equity. Dating discipline (a first-edition defect, corrected): the Dec-2025-dated legs are rolled 246 days to the 2026-08-18 anchor at the cost of equity; the three legs that are already anchor-dated — Kinan capitalized on H1-2026 run-rate earnings, Herfy's minority at its 18-Aug market price, and the July-2026 Mehbaj consideration — sit OUTSIDE the roll at their own dates. Per share: SAR 24.67 on the Dec-2025 basis, SAR 24.65 at the anchor after the SAR 1.70 dividend (ex 07-May-2026), on the 296.7mn ex-treasury divisor from the company's own Q2-2026 EPS note. Kinan alternatives are disclosed in the workbook: audited carrying SAR 436mn (floor), share of net assets SAR 601mn, capitalized earnings SAR 653mn (used).</w:t>
+        <w:t>Table 3 — from enterprise value to equity. Dating discipline (a first-edition defect, corrected): the Dec-2025-dated legs are rolled 246 days to the 2026-08-18 anchor at the cost of equity; the three legs that are already anchor-dated — Kinan capitalized on H1-2026 run-rate earnings, Herfy's minority at its 18-Aug market price, and the July-2026 Mehbaj consideration — sit OUTSIDE the roll at their own dates. Per share: SAR 23.69 on the Dec-2025 basis, SAR 23.60 at the anchor after the SAR 1.70 dividend (ex 07-May-2026), on the 296.7mn ex-treasury divisor from the company's own Q2-2026 EPS note. Kinan alternatives are disclosed in the workbook: audited carrying SAR 436mn (floor), share of net assets SAR 601mn, capitalized earnings SAR 653mn (used).</w:t>
       </w:r>
     </w:p>
     <w:p>
@@ -5422,7 +5422,7 @@
           <w:color w:val="1C3A36"/>
           <w:sz w:val="21"/>
         </w:rPr>
-        <w:t>The cash-flow lens (SAR 24.65) carries 45% because it is the only lens that prices the business bottom-up on its own disclosed units. Relative multiples (SAR 28.22) carry 25%: market-anchored, but imported capital. Normalised earnings power and the book lens carry 15% and 15% as the optimistic and the disciplined cross-reads. Weighted central: SAR 27.12 — -11% against spot — with the four bases spanning SAR 24.65 to SAR 35.12. The field is wide because the honest questions are wide: what price of capital, and does the expansion earn.</w:t>
+        <w:t>The cash-flow lens (SAR 23.60) carries 45% because it is the only lens that prices the business bottom-up on its own disclosed units. Relative multiples (SAR 28.22) carry 25%: market-anchored, but imported capital. Normalised earnings power and the book lens carry 15% and 15% as the optimistic and the disciplined cross-reads. Weighted central: SAR 26.64 — -12% against spot — with the four bases spanning SAR 23.60 to SAR 35.12. The field is wide because the honest questions are wide: what price of capital, and does the expansion earn.</w:t>
       </w:r>
     </w:p>
     <w:p>
@@ -6632,7 +6632,7 @@
                 <w:color w:val="1C3A36"/>
                 <w:sz w:val="17"/>
               </w:rPr>
-              <w:t>SAR 24.65</w:t>
+              <w:t>SAR 23.60</w:t>
             </w:r>
           </w:p>
         </w:tc>
@@ -6705,7 +6705,7 @@
                 <w:color w:val="1C3A36"/>
                 <w:sz w:val="17"/>
               </w:rPr>
-              <w:t>SAR 18.45</w:t>
+              <w:t>SAR 17.53</w:t>
             </w:r>
           </w:p>
         </w:tc>
@@ -6784,7 +6784,7 @@
                 <w:color w:val="1C3A36"/>
                 <w:sz w:val="17"/>
               </w:rPr>
-              <w:t>SAR 6.20 /share</w:t>
+              <w:t>SAR 6.07 /share</w:t>
             </w:r>
           </w:p>
         </w:tc>
@@ -6806,7 +6806,7 @@
           <w:color w:val="6E7B77"/>
           <w:sz w:val="17"/>
         </w:rPr>
-        <w:t>Table 6 — the contested judgement, with every path stated exactly as computed. Framing A is the base case everywhere in this study; Framing B is not a stress test but a coherent alternative reading of the same first-half evidence, and it sits far below the current share price — farther than in the first edition, because under the corrected conventions Framing B carries the full lease charge AND its own computed (lower) terminal return: a world of permanent density erosion is a world of structurally lower returns on capital, priced as such. A third judgement is priced beside these two: hold the store programme at the H1-2026 run-rate of +8 a year instead of guidance and the model reads SAR 19.12 — fewer stores, less lease debt, less density pressure, and a smaller terminal base. What would settle the crux: two or three quarters of like-for-like density — which Panda does not publish — or, failing that, the third-quarter revenue print against the store count, and the second-half store openings against the +16 the guidance base requires.</w:t>
+        <w:t>Table 6 — the contested judgement, with every path stated exactly as computed. Framing A is the base case everywhere in this study; Framing B is not a stress test but a coherent alternative reading of the same first-half evidence, and it sits far below the current share price — farther than in the first edition, because under the corrected conventions Framing B carries the full lease charge AND its own computed (lower) terminal return: a world of permanent density erosion is a world of structurally lower returns on capital, priced as such. A third judgement is priced beside these two: hold the store programme at the H1-2026 run-rate of +8 a year instead of guidance and the model reads SAR 18.23 — fewer stores, less lease debt, less density pressure, and a smaller terminal base. What would settle the crux: two or three quarters of like-for-like density — which Panda does not publish — or, failing that, the third-quarter revenue print against the store count, and the second-half store openings against the +16 the guidance base requires.</w:t>
       </w:r>
     </w:p>
     <w:p>
@@ -7585,7 +7585,7 @@
           <w:color w:val="6E7B77"/>
           <w:sz w:val="17"/>
         </w:rPr>
-        <w:t>Table 7 — the cost of capital, every component sourced and dated in the companion bibliography. Contested constructions are PRICED, not just named: at the CDS sovereign basis (Jan-2026 legs, flagged) the fair value is SAR 22.86; at −50bp / +50bp on the risk-free rate it is SAR 27.47 / SAR 22.12; the beta interval is priced in section 1.9.</w:t>
+        <w:t>Table 7 — the cost of capital, every component sourced and dated in the companion bibliography. Contested constructions are PRICED, not just named: at the CDS sovereign basis (Jan-2026 legs, flagged) the fair value is SAR 21.86; at −50bp / +50bp on the risk-free rate it is SAR 26.34 / SAR 21.14; the beta interval is priced in section 1.9.</w:t>
       </w:r>
     </w:p>
     <w:p>
@@ -7788,7 +7788,7 @@
                 <w:color w:val="1C3A36"/>
                 <w:sz w:val="17"/>
               </w:rPr>
-              <w:t>36.33</w:t>
+              <w:t>34.96</w:t>
             </w:r>
           </w:p>
         </w:tc>
@@ -7843,7 +7843,7 @@
                 <w:color w:val="1C3A36"/>
                 <w:sz w:val="17"/>
               </w:rPr>
-              <w:t>30.13</w:t>
+              <w:t>28.93</w:t>
             </w:r>
           </w:p>
         </w:tc>
@@ -7897,7 +7897,7 @@
                 <w:color w:val="1C3A36"/>
                 <w:sz w:val="17"/>
               </w:rPr>
-              <w:t>27.05</w:t>
+              <w:t>25.94</w:t>
             </w:r>
           </w:p>
         </w:tc>
@@ -7951,7 +7951,7 @@
                 <w:color w:val="1C3A36"/>
                 <w:sz w:val="17"/>
               </w:rPr>
-              <w:t>24.65</w:t>
+              <w:t>23.60</w:t>
             </w:r>
           </w:p>
         </w:tc>
@@ -8006,7 +8006,7 @@
                 <w:color w:val="1C3A36"/>
                 <w:sz w:val="17"/>
               </w:rPr>
-              <w:t>21.85</w:t>
+              <w:t>20.87</w:t>
             </w:r>
           </w:p>
         </w:tc>
@@ -8060,7 +8060,7 @@
                 <w:color w:val="1C3A36"/>
                 <w:sz w:val="17"/>
               </w:rPr>
-              <w:t>16.85</w:t>
+              <w:t>16.01</w:t>
             </w:r>
           </w:p>
         </w:tc>
@@ -8100,7 +8100,7 @@
           <w:color w:val="6E7B77"/>
           <w:sz w:val="17"/>
         </w:rPr>
-        <w:t>Table 8 — the beta interval, priced. The regression is usable but wide (R² 0.159): across its own 90% interval the fair value runs from SAR 16.85 to SAR 36.33. Every cost-of-equity-dependent leg re-runs inside these sensitivities — the Kinan capitalization included (the first edition froze it at the base rate). The single most valuable thing a longer post-restructuring trading history will give this valuation is a tighter beta.</w:t>
+        <w:t>Table 8 — the beta interval, priced. The regression is usable but wide (R² 0.159): across its own 90% interval the fair value runs from SAR 16.01 to SAR 34.96. Every cost-of-equity-dependent leg re-runs inside these sensitivities — the Kinan capitalization included (the first edition froze it at the base rate). The single most valuable thing a longer post-restructuring trading history will give this valuation is a tighter beta.</w:t>
       </w:r>
     </w:p>
     <w:p>
@@ -8114,7 +8114,7 @@
           <w:color w:val="1C3A36"/>
           <w:sz w:val="21"/>
         </w:rPr>
-        <w:t>The judgement variants, priced in one place: the store path at the H1 run-rate reads SAR 19.12; the density opening at −7.1% (the 213-store assumption end of the derivation range) reads SAR 24.18 against SAR 24.88 at the −6.0% interpolation end; reading the depreciation note's own columns the second way — accumulated depreciation over the year's charge rather than gross cost over it — reads SAR 22.82. The bear/bull scenario levers are published in full in the summary table's basis column and in the workbook.</w:t>
+        <w:t>The judgement variants, priced in one place: the store path at the H1 run-rate reads SAR 18.23; the density opening at −7.1% (the 213-store assumption end of the derivation range) reads SAR 23.14 against SAR 23.82 at the −6.0% interpolation end; reading the depreciation note's own columns the second way — accumulated depreciation over the year's charge rather than gross cost over it — reads SAR 21.82. The bear/bull scenario levers are published in full in the summary table's basis column and in the workbook.</w:t>
       </w:r>
     </w:p>
     <w:p>
@@ -9059,7 +9059,7 @@
           <w:color w:val="6E7B77"/>
           <w:sz w:val="17"/>
         </w:rPr>
-        <w:t>Figure 5 — the three-month price cone against the fundamental central of SAR 27.12. The fundamental read sits between the median and the upper quartile of the price map: a re-rating to the fundamental value is well inside ordinary three-month variation.</w:t>
+        <w:t>Figure 5 — the three-month price cone against the fundamental central of SAR 26.64. The fundamental read sits between the median and the upper quartile of the price map: a re-rating to the fundamental value is well inside ordinary three-month variation.</w:t>
       </w:r>
     </w:p>
     <w:p>
@@ -9209,7 +9209,7 @@
           <w:color w:val="1C3A36"/>
           <w:sz w:val="21"/>
         </w:rPr>
-        <w:t>The four lenses span SAR 24.65 to SAR 35.12, and the ordering is information, not noise. The book lens (SAR 24.67) is lowest: at recurring profitability Savola earns about its cost of equity, so undiscounted book is the floor. The cash-flow lens (SAR 24.65) adds the non-operating pocket and a terminal return modestly above cost. The market-anchored lenses (relative SAR 28.22, normalised SAR 35.12) are highest — and the reason is one number. The dividend-discount multiple this study's own cost of equity supports is 7.1x-8.4x (Gordon and two-stage forms — both computed in the workbook, alongside the 7.9x Expert 2's dividend model implies); Saudi consumer names trade at a mix-weighted 16.2x. The market prices these earnings at a cost of equity three to four and a half points cheaper than Savola's measured beta demands. Close that gap from either side — the beta drifting toward the market's implied risk, or the multiple de-rating toward the model's — and the lenses converge; until then the weighted central holds the tension explicitly.</w:t>
+        <w:t>The four lenses span SAR 23.60 to SAR 35.12, and the ordering is information, not noise. The book lens (SAR 24.67) is lowest: at recurring profitability Savola earns about its cost of equity, so undiscounted book is the floor. The cash-flow lens (SAR 23.60) adds the non-operating pocket and a terminal return modestly above cost. The market-anchored lenses (relative SAR 28.22, normalised SAR 35.12) are highest — and the reason is one number. The dividend-discount multiple this study's own cost of equity supports is 7.1x-8.4x (Gordon and two-stage forms — both computed in the workbook, alongside the 7.9x Expert 2's dividend model implies); Saudi consumer names trade at a mix-weighted 16.2x. The market prices these earnings at a cost of equity three to four and a half points cheaper than Savola's measured beta demands. Close that gap from either side — the beta drifting toward the market's implied risk, or the multiple de-rating toward the model's — and the lenses converge; until then the weighted central holds the tension explicitly.</w:t>
       </w:r>
     </w:p>
     <w:p>
@@ -9412,7 +9412,7 @@
           <w:color w:val="1C3A36"/>
           <w:sz w:val="21"/>
         </w:rPr>
-        <w:t>Put sections 1 and 3 side by side. The weighted central of SAR 27.12 sits between the median and the upper quartile of the three-month price map — the market needs nothing unusual to close the gap; ordinary variation covers it. The Framing B reading of SAR 18.45 now sits near the map's fifth percentile: under the corrected conventions the no-turn story is a tail outcome, and the current price sits well above it — the market is pricing neither collapse nor the full base case, but the space between the run-rate variant (SAR 19.12) and the central. The zones to watch: below SAR 22.59 the price has broken the year's shelf and the market is moving toward the erosion framings with conviction; above SAR 26.29-27.19 the recovery leg is re-established and the first half's operating momentum is being paid for. Neither price move would change the fundamental work — but each would say which framing the market believes, and section 1.7 says exactly what evidence would justify believing it.</w:t>
+        <w:t>Put sections 1 and 3 side by side. The weighted central of SAR 26.64 sits between the median and the upper quartile of the three-month price map — the market needs nothing unusual to close the gap; ordinary variation covers it. The Framing B reading of SAR 17.53 now sits near the map's fifth percentile: under the corrected conventions the no-turn story is a tail outcome, and the current price sits well above it — the market is pricing neither collapse nor the full base case, but the space between the run-rate variant (SAR 18.23) and the central. The zones to watch: below SAR 22.59 the price has broken the year's shelf and the market is moving toward the erosion framings with conviction; above SAR 26.29-27.19 the recovery leg is re-established and the first half's operating momentum is being paid for. Neither price move would change the fundamental work — but each would say which framing the market believes, and section 1.7 says exactly what evidence would justify believing it.</w:t>
       </w:r>
     </w:p>
     <w:p>
@@ -9447,7 +9447,7 @@
           <w:color w:val="1C3A36"/>
           <w:sz w:val="21"/>
         </w:rPr>
-        <w:t>79% of enterprise value is beyond 2030, and what that block charges for keeping the assets going is now the judgement that matters. It rests on a 18.0-year life derived from the depreciation note's own columns rather than on a rate of return we chose; read the same note the other way and the answer is SAR 22.82 instead of SAR 24.65, which is the honest width of that judgement. The share ROSE from the first edition's 76% because charging the full lease additions back-loads the explicit cash flows — the honest consequence of the correction, stated rather than smoothed. Section 1.9 prices the alternatives.</w:t>
+        <w:t>79% of enterprise value is beyond 2030, and what that block charges for keeping the assets going is now the judgement that matters. It rests on a 18.0-year life derived from the depreciation note's own columns rather than on a rate of return we chose; read the same note the other way and the answer is SAR 21.82 instead of SAR 23.60, which is the honest width of that judgement. The share ROSE from the first edition's 76% because charging the full lease additions back-loads the explicit cash flows — the honest consequence of the correction, stated rather than smoothed. Section 1.9 prices the alternatives.</w:t>
       </w:r>
     </w:p>
     <w:p>
@@ -9552,7 +9552,7 @@
           <w:color w:val="1C3A36"/>
           <w:sz w:val="21"/>
         </w:rPr>
-        <w:t>The guidance base needs +16 net openings in H2-2026 after +4 in H1. FY2025 delivered +18 net over the full year, so an H2-weighted cadence has precedent — but the half-split is not disclosed, and the +8/yr run-rate variant is worth SAR 5.52 per share on the cash-flow lens. The H2 openings count is the cheapest single piece of evidence this valuation can receive.</w:t>
+        <w:t>The guidance base needs +16 net openings in H2-2026 after +4 in H1. FY2025 delivered +18 net over the full year, so an H2-weighted cadence has precedent — but the half-split is not disclosed, and the +8/yr run-rate variant is worth SAR 5.37 per share on the cash-flow lens. The H2 openings count is the cheapest single piece of evidence this valuation can receive.</w:t>
       </w:r>
     </w:p>
     <w:p>
@@ -9573,7 +9573,7 @@
           <w:color w:val="1C3A36"/>
           <w:sz w:val="21"/>
         </w:rPr>
-        <w:t>Two more quarters of density erosion at the measured pace (Framing B: SAR 18.45, below spot) — or a second-half margin print above the first half plus a stabilising store base (the bull scenario: SAR 32.95). The evidence that decides is named in section 1.7.</w:t>
+        <w:t>Two more quarters of density erosion at the measured pace (Framing B: SAR 17.53, below spot) — or a second-half margin print above the first half plus a stabilising store base (the bull scenario: SAR 31.73). The evidence that decides is named in section 1.7.</w:t>
       </w:r>
     </w:p>
     <w:p>
@@ -14124,7 +14124,7 @@
           <w:color w:val="1C3A36"/>
           <w:sz w:val="21"/>
         </w:rPr>
-        <w:t>The peer table and the multiple construction sit in section 1.3; the workbook's Peer &amp; Sector sheet carries the same quotes with Savola's own implied multiples beside them: at the model's fair value Savola stands at 10.03x FY2026E earnings and 5.31x FY2026E EBITDA (lease-inclusive), against 12.33x and the peer set's 12-20x earnings range.</w:t>
+        <w:t>The peer table and the multiple construction sit in section 1.3; the workbook's Peer &amp; Sector sheet carries the same quotes with Savola's own implied multiples beside them: at the model's fair value Savola stands at 9.60x FY2026E earnings and 5.19x FY2026E EBITDA (lease-inclusive), against 12.33x and the peer set's 12-20x earnings range.</w:t>
       </w:r>
     </w:p>
     <w:p>
@@ -14607,7 +14607,7 @@
                 <w:color w:val="1C3A36"/>
                 <w:sz w:val="17"/>
               </w:rPr>
-              <w:t>the +8/yr run-rate variant is priced: SAR 19.12</w:t>
+              <w:t>the +8/yr run-rate variant is priced: SAR 18.23</w:t>
             </w:r>
           </w:p>
         </w:tc>
@@ -18150,7 +18150,7 @@
           <w:color w:val="1C3A36"/>
           <w:sz w:val="21"/>
         </w:rPr>
-        <w:t>Force the three to one number and the argument, not the average, is the output. Expert 1 (SAR 37.60) prices the pieces at the market's capital; Expert 2 (SAR 19.04) prices the payout at the model's capital; Expert 3 (SAR 21.54) prices the capital itself and finds little excess. The median — SAR 21.54 — lands below the study's weighted central of SAR 27.12, and the gap is the same single disagreement running through the whole study: what return this capital deserves, and whether the expansion earns above it.</w:t>
+        <w:t>Force the three to one number and the argument, not the average, is the output. Expert 1 (SAR 37.60) prices the pieces at the market's capital; Expert 2 (SAR 19.04) prices the payout at the model's capital; Expert 3 (SAR 21.54) prices the capital itself and finds little excess. The median — SAR 21.54 — lands below the study's weighted central of SAR 26.64, and the gap is the same single disagreement running through the whole study: what return this capital deserves, and whether the expansion earns above it.</w:t>
       </w:r>
     </w:p>
     <w:p>
@@ -18665,7 +18665,7 @@
           <w:color w:val="1C3A36"/>
           <w:sz w:val="21"/>
         </w:rPr>
-        <w:t>This second edition (19-Aug-2026) answers four independent external critiques of the 18-Aug-2026 first edition, worked finding by finding under the project's critique-response procedure: 82 findings enumerated, each priced through the model before any verdict. The corrections that moved value, at the first edition's central: charging the FULL lease additions in the cash-flow waterfall rather than renewals only (-3.97% — the largest, and the one the first edition's own balance sheet already implied); computing the terminal return from the model's own year five instead of inputting 10.5% (-1.6%); the relative lens rebuilt trailing-on-trailing with Al Othaim n/m (-3.2% before the offsetting quote refresh); the Tiryaki receivable moved from working capital to the bridge (+1.6%); the book lens on one consistent FY2026 base (+2.5%); the settled 18-Aug close of SAR 25.40 replacing an intraday 25.30 print; the published SAR sovereign curve replacing a constructed proxy; 30-Jun-2026 debt in the capital-structure weights; the ex-treasury share divisor (+0.7%); the investment property retained in the bridge after the audited segment note showed its rent is inter-segment and outside group EBITDA — a reversal of one accepted critique finding, with the receipt in the response record; and the three anchor-dated bridge legs held outside the Dec-2025 roll. Net: weighted central SAR 28.02 → SAR 27.12 (-3.2%), and against the settled close the premium reads -11% where the first edition claimed +11% against the stale print. Expert 3 and Expert 1 were rebuilt (their appendix tables say how); the panel median moved SAR 19.82 → SAR 21.54. Two critiques were rejected in full where their receipts failed — one would have removed the lease charge entirely (+13.8% of central, the mirror image of the real defect), the other affirmed the first edition without qualification; the full ledger, including what each rejected finding would have been worth, sits in the response record beside this study's repository.</w:t>
+        <w:t>This second edition (19-Aug-2026) answers four independent external critiques of the 18-Aug-2026 first edition, worked finding by finding under the project's critique-response procedure: 82 findings enumerated, each priced through the model before any verdict. The corrections that moved value, at the first edition's central: charging the FULL lease additions in the cash-flow waterfall rather than renewals only (-3.97% — the largest, and the one the first edition's own balance sheet already implied); computing the terminal return from the model's own year five instead of inputting 10.5% (-1.6%); the relative lens rebuilt trailing-on-trailing with Al Othaim n/m (-3.2% before the offsetting quote refresh); the Tiryaki receivable moved from working capital to the bridge (+1.6%); the book lens on one consistent FY2026 base (+2.5%); the settled 18-Aug close of SAR 25.40 replacing an intraday 25.30 print; the published SAR sovereign curve replacing a constructed proxy; 30-Jun-2026 debt in the capital-structure weights; the ex-treasury share divisor (+0.7%); the investment property retained in the bridge after the audited segment note showed its rent is inter-segment and outside group EBITDA — a reversal of one accepted critique finding, with the receipt in the response record; and the three anchor-dated bridge legs held outside the Dec-2025 roll. Net: weighted central SAR 28.02 → SAR 26.64 (-4.9%), and against the settled close the premium reads -12% where the first edition claimed +11% against the stale print. Expert 3 and Expert 1 were rebuilt (their appendix tables say how); the panel median moved SAR 19.82 → SAR 21.54. Two critiques were rejected in full where their receipts failed — one would have removed the lease charge entirely (+13.8% of central, the mirror image of the real defect), the other affirmed the first edition without qualification; the full ledger, including what each rejected finding would have been worth, sits in the response record beside this study's repository.</w:t>
       </w:r>
     </w:p>
     <w:p>

</xml_diff>